<commit_message>
fixes analysis type options
</commit_message>
<xml_diff>
--- a/Equations/Kdb.docx
+++ b/Equations/Kdb.docx
@@ -3,20 +3,11 @@
 <w:document xmlns:wpc="http://schemas.microsoft.com/office/word/2010/wordprocessingCanvas" xmlns:cx="http://schemas.microsoft.com/office/drawing/2014/chartex" xmlns:cx1="http://schemas.microsoft.com/office/drawing/2015/9/8/chartex" xmlns:cx2="http://schemas.microsoft.com/office/drawing/2015/10/21/chartex" xmlns:cx3="http://schemas.microsoft.com/office/drawing/2016/5/9/chartex" xmlns:cx4="http://schemas.microsoft.com/office/drawing/2016/5/10/chartex" xmlns:cx5="http://schemas.microsoft.com/office/drawing/2016/5/11/chartex" xmlns:cx6="http://schemas.microsoft.com/office/drawing/2016/5/12/chartex" xmlns:cx7="http://schemas.microsoft.com/office/drawing/2016/5/13/chartex" xmlns:cx8="http://schemas.microsoft.com/office/drawing/2016/5/14/chartex" xmlns:mc="http://schemas.openxmlformats.org/markup-compatibility/2006" xmlns:aink="http://schemas.microsoft.com/office/drawing/2016/ink" xmlns:am3d="http://schemas.microsoft.com/office/drawing/2017/model3d" xmlns:o="urn:schemas-microsoft-com:office:office" xmlns:oel="http://schemas.microsoft.com/office/2019/extlst" xmlns:r="http://schemas.openxmlformats.org/officeDocument/2006/relationships" xmlns:m="http://schemas.openxmlformats.org/officeDocument/2006/math" xmlns:v="urn:schemas-microsoft-com:vml" xmlns:wp14="http://schemas.microsoft.com/office/word/2010/wordprocessingDrawing" xmlns:wp="http://schemas.openxmlformats.org/drawingml/2006/wordprocessingDrawing" xmlns:w10="urn:schemas-microsoft-com:office:word" xmlns:w="http://schemas.openxmlformats.org/wordprocessingml/2006/main" xmlns:w14="http://schemas.microsoft.com/office/word/2010/wordml" xmlns:w15="http://schemas.microsoft.com/office/word/2012/wordml" xmlns:w16cex="http://schemas.microsoft.com/office/word/2018/wordml/cex" xmlns:w16cid="http://schemas.microsoft.com/office/word/2016/wordml/cid" xmlns:w16="http://schemas.microsoft.com/office/word/2018/wordml" xmlns:w16du="http://schemas.microsoft.com/office/word/2023/wordml/word16du" xmlns:w16sdtdh="http://schemas.microsoft.com/office/word/2020/wordml/sdtdatahash" xmlns:w16sdtfl="http://schemas.microsoft.com/office/word/2024/wordml/sdtformatlock" xmlns:w16se="http://schemas.microsoft.com/office/word/2015/wordml/symex" xmlns:wpg="http://schemas.microsoft.com/office/word/2010/wordprocessingGroup" xmlns:wpi="http://schemas.microsoft.com/office/word/2010/wordprocessingInk" xmlns:wne="http://schemas.microsoft.com/office/word/2006/wordml" xmlns:wps="http://schemas.microsoft.com/office/word/2010/wordprocessingShape" mc:Ignorable="w14 w15 w16se w16cid w16 w16cex w16sdtdh w16sdtfl w16du wp14">
   <w:body>
     <w:p/>
-    <w:p>
-      <w:pPr>
-        <w:rPr>
-          <w:b/>
-          <w:bCs/>
-        </w:rPr>
-      </w:pPr>
-    </w:p>
+    <w:p/>
     <w:p>
       <w:pPr>
         <w:rPr>
           <w:rFonts w:eastAsiaTheme="minorEastAsia"/>
-          <w:b/>
-          <w:bCs/>
         </w:rPr>
       </w:pPr>
       <m:oMathPara>
@@ -29,17 +20,12 @@
               <m:ctrlPr>
                 <w:rPr>
                   <w:rFonts w:ascii="Cambria Math" w:hAnsi="Cambria Math"/>
-                  <w:b/>
-                  <w:bCs/>
                   <w:i/>
                 </w:rPr>
               </m:ctrlPr>
             </m:sSubPr>
             <m:e>
               <m:r>
-                <m:rPr>
-                  <m:sty m:val="bi"/>
-                </m:rPr>
                 <w:rPr>
                   <w:rFonts w:ascii="Cambria Math" w:hAnsi="Cambria Math"/>
                 </w:rPr>
@@ -48,9 +34,6 @@
             </m:e>
             <m:sub>
               <m:r>
-                <m:rPr>
-                  <m:sty m:val="bi"/>
-                </m:rPr>
                 <w:rPr>
                   <w:rFonts w:ascii="Cambria Math" w:hAnsi="Cambria Math"/>
                 </w:rPr>
@@ -59,9 +42,6 @@
             </m:sub>
           </m:sSub>
           <m:r>
-            <m:rPr>
-              <m:sty m:val="bi"/>
-            </m:rPr>
             <w:rPr>
               <w:rFonts w:ascii="Cambria Math" w:hAnsi="Cambria Math"/>
             </w:rPr>
@@ -74,8 +54,6 @@
               <m:ctrlPr>
                 <w:rPr>
                   <w:rFonts w:ascii="Cambria Math" w:hAnsi="Cambria Math"/>
-                  <w:b/>
-                  <w:bCs/>
                   <w:i/>
                 </w:rPr>
               </m:ctrlPr>
@@ -94,8 +72,6 @@
                   <m:ctrlPr>
                     <w:rPr>
                       <w:rFonts w:ascii="Cambria Math" w:hAnsi="Cambria Math"/>
-                      <w:b/>
-                      <w:bCs/>
                       <w:i/>
                     </w:rPr>
                   </m:ctrlPr>
@@ -103,9 +79,6 @@
                 <m:mr>
                   <m:e>
                     <m:r>
-                      <m:rPr>
-                        <m:sty m:val="bi"/>
-                      </m:rPr>
                       <w:rPr>
                         <w:rFonts w:ascii="Cambria Math" w:hAnsi="Cambria Math"/>
                       </w:rPr>
@@ -120,8 +93,6 @@
                         <m:ctrlPr>
                           <w:rPr>
                             <w:rFonts w:ascii="Cambria Math" w:hAnsi="Cambria Math"/>
-                            <w:b/>
-                            <w:bCs/>
                             <w:i/>
                           </w:rPr>
                         </m:ctrlPr>
@@ -129,7 +100,7 @@
                       <m:fName>
                         <m:r>
                           <m:rPr>
-                            <m:sty m:val="b"/>
+                            <m:sty m:val="p"/>
                           </m:rPr>
                           <w:rPr>
                             <w:rFonts w:ascii="Cambria Math" w:hAnsi="Cambria Math"/>
@@ -143,8 +114,6 @@
                             <m:ctrlPr>
                               <w:rPr>
                                 <w:rFonts w:ascii="Cambria Math" w:hAnsi="Cambria Math"/>
-                                <w:b/>
-                                <w:bCs/>
                                 <w:i/>
                               </w:rPr>
                             </m:ctrlPr>
@@ -155,8 +124,6 @@
                                 <m:ctrlPr>
                                   <w:rPr>
                                     <w:rFonts w:ascii="Cambria Math" w:hAnsi="Cambria Math"/>
-                                    <w:b/>
-                                    <w:bCs/>
                                     <w:i/>
                                   </w:rPr>
                                 </m:ctrlPr>
@@ -167,17 +134,12 @@
                                     <m:ctrlPr>
                                       <w:rPr>
                                         <w:rFonts w:ascii="Cambria Math" w:hAnsi="Cambria Math"/>
-                                        <w:b/>
-                                        <w:bCs/>
                                         <w:i/>
                                       </w:rPr>
                                     </m:ctrlPr>
                                   </m:sSubPr>
                                   <m:e>
                                     <m:r>
-                                      <m:rPr>
-                                        <m:sty m:val="bi"/>
-                                      </m:rPr>
                                       <w:rPr>
                                         <w:rFonts w:ascii="Cambria Math" w:hAnsi="Cambria Math"/>
                                       </w:rPr>
@@ -186,9 +148,6 @@
                                   </m:e>
                                   <m:sub>
                                     <m:r>
-                                      <m:rPr>
-                                        <m:sty m:val="bi"/>
-                                      </m:rPr>
                                       <w:rPr>
                                         <w:rFonts w:ascii="Cambria Math" w:hAnsi="Cambria Math"/>
                                       </w:rPr>
@@ -203,17 +162,12 @@
                                     <m:ctrlPr>
                                       <w:rPr>
                                         <w:rFonts w:ascii="Cambria Math" w:hAnsi="Cambria Math"/>
-                                        <w:b/>
-                                        <w:bCs/>
                                         <w:i/>
                                       </w:rPr>
                                     </m:ctrlPr>
                                   </m:sSubPr>
                                   <m:e>
                                     <m:r>
-                                      <m:rPr>
-                                        <m:sty m:val="bi"/>
-                                      </m:rPr>
                                       <w:rPr>
                                         <w:rFonts w:ascii="Cambria Math" w:hAnsi="Cambria Math"/>
                                       </w:rPr>
@@ -222,9 +176,6 @@
                                   </m:e>
                                   <m:sub>
                                     <m:r>
-                                      <m:rPr>
-                                        <m:sty m:val="bi"/>
-                                      </m:rPr>
                                       <w:rPr>
                                         <w:rFonts w:ascii="Cambria Math" w:hAnsi="Cambria Math"/>
                                       </w:rPr>
@@ -235,9 +186,6 @@
                               </m:den>
                             </m:f>
                             <m:r>
-                              <m:rPr>
-                                <m:sty m:val="bi"/>
-                              </m:rPr>
                               <w:rPr>
                                 <w:rFonts w:ascii="Cambria Math" w:hAnsi="Cambria Math"/>
                               </w:rPr>
@@ -248,9 +196,6 @@
                       </m:e>
                     </m:func>
                     <m:r>
-                      <m:rPr>
-                        <m:sty m:val="bi"/>
-                      </m:rPr>
                       <w:rPr>
                         <w:rFonts w:ascii="Cambria Math" w:hAnsi="Cambria Math"/>
                       </w:rPr>
@@ -261,17 +206,12 @@
                         <m:ctrlPr>
                           <w:rPr>
                             <w:rFonts w:ascii="Cambria Math" w:hAnsi="Cambria Math"/>
-                            <w:b/>
-                            <w:bCs/>
                             <w:i/>
                           </w:rPr>
                         </m:ctrlPr>
                       </m:sSubPr>
                       <m:e>
                         <m:r>
-                          <m:rPr>
-                            <m:sty m:val="bi"/>
-                          </m:rPr>
                           <w:rPr>
                             <w:rFonts w:ascii="Cambria Math" w:hAnsi="Cambria Math"/>
                           </w:rPr>
@@ -280,9 +220,6 @@
                       </m:e>
                       <m:sub>
                         <m:r>
-                          <m:rPr>
-                            <m:sty m:val="bi"/>
-                          </m:rPr>
                           <w:rPr>
                             <w:rFonts w:ascii="Cambria Math" w:hAnsi="Cambria Math"/>
                           </w:rPr>
@@ -291,9 +228,6 @@
                       </m:sub>
                     </m:sSub>
                     <m:r>
-                      <m:rPr>
-                        <m:sty m:val="bi"/>
-                      </m:rPr>
                       <w:rPr>
                         <w:rFonts w:ascii="Cambria Math" w:hAnsi="Cambria Math"/>
                       </w:rPr>
@@ -304,9 +238,6 @@
                 <m:mr>
                   <m:e>
                     <m:r>
-                      <m:rPr>
-                        <m:sty m:val="bi"/>
-                      </m:rPr>
                       <w:rPr>
                         <w:rFonts w:ascii="Cambria Math" w:hAnsi="Cambria Math"/>
                       </w:rPr>
@@ -317,17 +248,12 @@
                         <m:ctrlPr>
                           <w:rPr>
                             <w:rFonts w:ascii="Cambria Math" w:hAnsi="Cambria Math"/>
-                            <w:b/>
-                            <w:bCs/>
                             <w:i/>
                           </w:rPr>
                         </m:ctrlPr>
                       </m:sSubPr>
                       <m:e>
                         <m:r>
-                          <m:rPr>
-                            <m:sty m:val="bi"/>
-                          </m:rPr>
                           <w:rPr>
                             <w:rFonts w:ascii="Cambria Math" w:hAnsi="Cambria Math"/>
                           </w:rPr>
@@ -336,9 +262,6 @@
                       </m:e>
                       <m:sub>
                         <m:r>
-                          <m:rPr>
-                            <m:sty m:val="bi"/>
-                          </m:rPr>
                           <w:rPr>
                             <w:rFonts w:ascii="Cambria Math" w:hAnsi="Cambria Math"/>
                           </w:rPr>
@@ -347,9 +270,6 @@
                       </m:sub>
                     </m:sSub>
                     <m:r>
-                      <m:rPr>
-                        <m:sty m:val="bi"/>
-                      </m:rPr>
                       <w:rPr>
                         <w:rFonts w:ascii="Cambria Math" w:hAnsi="Cambria Math"/>
                       </w:rPr>
@@ -367,8 +287,6 @@
       <w:pPr>
         <w:rPr>
           <w:rFonts w:eastAsiaTheme="minorEastAsia"/>
-          <w:b/>
-          <w:bCs/>
         </w:rPr>
       </w:pPr>
       <m:oMathPara>
@@ -377,9 +295,6 @@
         </m:oMathParaPr>
         <m:oMath>
           <m:r>
-            <m:rPr>
-              <m:sty m:val="bi"/>
-            </m:rPr>
             <w:rPr>
               <w:rFonts w:ascii="Cambria Math" w:eastAsiaTheme="minorEastAsia" w:hAnsi="Cambria Math"/>
             </w:rPr>
@@ -392,8 +307,6 @@
       <w:pPr>
         <w:rPr>
           <w:rFonts w:eastAsiaTheme="minorEastAsia"/>
-          <w:b/>
-          <w:bCs/>
         </w:rPr>
       </w:pPr>
       <m:oMathPara>
@@ -406,17 +319,12 @@
               <m:ctrlPr>
                 <w:rPr>
                   <w:rFonts w:ascii="Cambria Math" w:eastAsiaTheme="minorEastAsia" w:hAnsi="Cambria Math"/>
-                  <w:b/>
-                  <w:bCs/>
                   <w:i/>
                 </w:rPr>
               </m:ctrlPr>
             </m:sSubPr>
             <m:e>
               <m:r>
-                <m:rPr>
-                  <m:sty m:val="bi"/>
-                </m:rPr>
                 <w:rPr>
                   <w:rFonts w:ascii="Cambria Math" w:eastAsiaTheme="minorEastAsia" w:hAnsi="Cambria Math"/>
                 </w:rPr>
@@ -425,9 +333,6 @@
             </m:e>
             <m:sub>
               <m:r>
-                <m:rPr>
-                  <m:sty m:val="bi"/>
-                </m:rPr>
                 <w:rPr>
                   <w:rFonts w:ascii="Cambria Math" w:eastAsiaTheme="minorEastAsia" w:hAnsi="Cambria Math"/>
                 </w:rPr>
@@ -436,9 +341,6 @@
             </m:sub>
           </m:sSub>
           <m:r>
-            <m:rPr>
-              <m:sty m:val="bi"/>
-            </m:rPr>
             <w:rPr>
               <w:rFonts w:ascii="Cambria Math" w:eastAsiaTheme="minorEastAsia" w:hAnsi="Cambria Math"/>
             </w:rPr>
@@ -451,8 +353,6 @@
       <w:pPr>
         <w:rPr>
           <w:rFonts w:eastAsiaTheme="minorEastAsia"/>
-          <w:b/>
-          <w:bCs/>
         </w:rPr>
       </w:pPr>
       <m:oMathPara>
@@ -465,17 +365,12 @@
               <m:ctrlPr>
                 <w:rPr>
                   <w:rFonts w:ascii="Cambria Math" w:eastAsiaTheme="minorEastAsia" w:hAnsi="Cambria Math"/>
-                  <w:b/>
-                  <w:bCs/>
                   <w:i/>
                 </w:rPr>
               </m:ctrlPr>
             </m:sSubPr>
             <m:e>
               <m:r>
-                <m:rPr>
-                  <m:sty m:val="bi"/>
-                </m:rPr>
                 <w:rPr>
                   <w:rFonts w:ascii="Cambria Math" w:eastAsiaTheme="minorEastAsia" w:hAnsi="Cambria Math"/>
                 </w:rPr>
@@ -484,9 +379,6 @@
             </m:e>
             <m:sub>
               <m:r>
-                <m:rPr>
-                  <m:sty m:val="bi"/>
-                </m:rPr>
                 <w:rPr>
                   <w:rFonts w:ascii="Cambria Math" w:eastAsiaTheme="minorEastAsia" w:hAnsi="Cambria Math"/>
                 </w:rPr>
@@ -495,9 +387,6 @@
             </m:sub>
           </m:sSub>
           <m:r>
-            <m:rPr>
-              <m:sty m:val="bi"/>
-            </m:rPr>
             <w:rPr>
               <w:rFonts w:ascii="Cambria Math" w:eastAsiaTheme="minorEastAsia" w:hAnsi="Cambria Math"/>
             </w:rPr>

</xml_diff>